<commit_message>
docs: note the spread of the start-up measurements
</commit_message>
<xml_diff>
--- a/docs/reports/stage4-comparison.docx
+++ b/docs/reports/stage4-comparison.docx
@@ -6453,19 +6453,67 @@
         <w:rPr>
           <w:lang w:val="uk"/>
         </w:rPr>
-        <w:t xml:space="preserve">процесів Electron і під’єднання до них Playwright, тому для користувача з уже</w:t>
-      </w:r>
-      <w:r>
-        <w:rPr>
-          <w:lang w:val="uk"/>
-        </w:rPr>
-        <w:t xml:space="preserve"> </w:t>
-      </w:r>
-      <w:r>
-        <w:rPr>
-          <w:lang w:val="uk"/>
-        </w:rPr>
-        <w:t xml:space="preserve">відкритим браузером сайт відкривається не повільніше за застосунок.</w:t>
+        <w:t xml:space="preserve">процесів Electron і під’єднання до них Playwright, тому за цими медіанами для</w:t>
+      </w:r>
+      <w:r>
+        <w:rPr>
+          <w:lang w:val="uk"/>
+        </w:rPr>
+        <w:t xml:space="preserve"> </w:t>
+      </w:r>
+      <w:r>
+        <w:rPr>
+          <w:lang w:val="uk"/>
+        </w:rPr>
+        <w:t xml:space="preserve">користувача з уже відкритим браузером сайт відкривається не повільніше за</w:t>
+      </w:r>
+      <w:r>
+        <w:rPr>
+          <w:lang w:val="uk"/>
+        </w:rPr>
+        <w:t xml:space="preserve"> </w:t>
+      </w:r>
+      <w:r>
+        <w:rPr>
+          <w:lang w:val="uk"/>
+        </w:rPr>
+        <w:t xml:space="preserve">застосунок. Проте час запуску помітно коливається між запусками: контрольний</w:t>
+      </w:r>
+      <w:r>
+        <w:rPr>
+          <w:lang w:val="uk"/>
+        </w:rPr>
+        <w:t xml:space="preserve"> </w:t>
+      </w:r>
+      <w:r>
+        <w:rPr>
+          <w:lang w:val="uk"/>
+        </w:rPr>
+        <w:t xml:space="preserve">запуск після всіх виправлень дав 898 мс для десктопа і 3495 мс для веба з</w:t>
+      </w:r>
+      <w:r>
+        <w:rPr>
+          <w:lang w:val="uk"/>
+        </w:rPr>
+        <w:t xml:space="preserve"> </w:t>
+      </w:r>
+      <w:r>
+        <w:rPr>
+          <w:lang w:val="uk"/>
+        </w:rPr>
+        <w:t xml:space="preserve">порожнім кешем (135 мс з кешем), а причину окремо не досліджували. Тому ці</w:t>
+      </w:r>
+      <w:r>
+        <w:rPr>
+          <w:lang w:val="uk"/>
+        </w:rPr>
+        <w:t xml:space="preserve"> </w:t>
+      </w:r>
+      <w:r>
+        <w:rPr>
+          <w:lang w:val="uk"/>
+        </w:rPr>
+        <w:t xml:space="preserve">значення показують порядок величин, а не точне співвідношення клієнтів.</w:t>
       </w:r>
     </w:p>
     <w:p>

</xml_diff>